<commit_message>
Apply approved stop-work decisions for HCO AAC.5, AAC.8, AAC.9
Soften AAC.5 escalation wording; split AAC.8/AAC.9 screening gates;
frame AAC.9 pregnancy hold as hospital safety practice (not NABH OE).
AAC.3 unchanged per approval. Persist HCO edition_label on rebuild.

Co-authored-by: upadhyaymehul9-prog <upadhyaymehul9-prog@users.noreply.github.com>
</commit_message>
<xml_diff>
--- a/policies/build/masters/HCO.AAC.8_v2_master.docx
+++ b/policies/build/masters/HCO.AAC.8_v2_master.docx
@@ -1417,19 +1417,7 @@
           <w:sz w:val="22"/>
           <w:szCs w:val="22"/>
         </w:rPr>
-        <w:t xml:space="preserve">Do not scan or expose a patient when required legal compliance for the modality is missing — AERB clearance and RSO cover for radiation equipment; PC-PNDT registration and displays for covered ultrasound.</w:t>
-      </w:r>
-    </w:p>
-    <w:p>
-      <w:pPr>
-        <w:spacing w:after="140"/>
-      </w:pPr>
-      <w:r>
-        <w:rPr>
-          <w:sz w:val="22"/>
-          <w:szCs w:val="22"/>
-        </w:rPr>
-        <w:t xml:space="preserve">Do not proceed with radiation or MRI examinations when the safety/pregnancy/MRI screening required under AAC.9 has not been completed for the patient (and attendant entering the area). Complete screening before exposure.</w:t>
+        <w:t xml:space="preserve">Do not scan or expose a patient when required legal compliance for the modality is missing — AERB clearance and RSO cover for radiation equipment; PC-PNDT registration and displays for covered ultrasound (PC-PNDT only where ultrasound / PC-PNDT scope applies).</w:t>
       </w:r>
     </w:p>
     <w:p>
@@ -1442,6 +1430,18 @@
           <w:szCs w:val="22"/>
         </w:rPr>
         <w:t xml:space="preserve">Do not use radiation-emitting equipment when mandatory personnel monitoring (dosimeter/TLD) or required lead protection for the examination is unavailable.</w:t>
+      </w:r>
+    </w:p>
+    <w:p>
+      <w:pPr>
+        <w:spacing w:after="140"/>
+      </w:pPr>
+      <w:r>
+        <w:rPr>
+          <w:sz w:val="22"/>
+          <w:szCs w:val="22"/>
+        </w:rPr>
+        <w:t xml:space="preserve">Screening gates are in AAC.9.</w:t>
       </w:r>
     </w:p>
     <w:p>

</xml_diff>